<commit_message>
release: verified build (merge-preserving)
</commit_message>
<xml_diff>
--- a/samples/diagnosis-sample.docx
+++ b/samples/diagnosis-sample.docx
@@ -3,9 +3,15 @@
 <w:document xmlns:wpc="http://schemas.microsoft.com/office/word/2010/wordprocessingCanvas" xmlns:mo="http://schemas.microsoft.com/office/mac/office/2008/main" xmlns:mc="http://schemas.openxmlformats.org/markup-compatibility/2006" xmlns:mv="urn:schemas-microsoft-com:mac:vml" xmlns:o="urn:schemas-microsoft-com:office:office" xmlns:r="http://schemas.openxmlformats.org/officeDocument/2006/relationships" xmlns:m="http://schemas.openxmlformats.org/officeDocument/2006/math" xmlns:v="urn:schemas-microsoft-com:vml" xmlns:wp14="http://schemas.microsoft.com/office/word/2010/wordprocessingDrawing" xmlns:wp="http://schemas.openxmlformats.org/drawingml/2006/wordprocessingDrawing" xmlns:w10="urn:schemas-microsoft-com:office:word" xmlns:w="http://schemas.openxmlformats.org/wordprocessingml/2006/main" xmlns:w14="http://schemas.microsoft.com/office/word/2010/wordml" xmlns:wpg="http://schemas.microsoft.com/office/word/2010/wordprocessingGroup" xmlns:wpi="http://schemas.microsoft.com/office/word/2010/wordprocessingInk" xmlns:wne="http://schemas.microsoft.com/office/word/2006/wordml" xmlns:wps="http://schemas.microsoft.com/office/word/2010/wordprocessingShape" mc:Ignorable="w14 wp14">
   <w:body>
     <w:p>
+      <w:pPr>
+        <w:spacing w:after="0"/>
+        <w:pBdr>
+          <w:bottom w:val="single" w:sz="12" w:space="6" w:color="1F6FEB"/>
+        </w:pBdr>
+      </w:pPr>
       <w:r>
         <w:rPr>
-          <w:rFonts w:ascii="Calibri" w:hAnsi="Calibri" w:eastAsia="Microsoft YaHei"/>
+          <w:rFonts w:ascii="Calibri" w:hAnsi="Calibri" w:eastAsia="Calibri"/>
           <w:b/>
           <w:color w:val="1F6FEB"/>
           <w:sz w:val="22"/>
@@ -14,91 +20,25 @@
       </w:r>
       <w:r>
         <w:rPr>
-          <w:rFonts w:ascii="Calibri" w:hAnsi="Calibri" w:eastAsia="Microsoft YaHei"/>
+          <w:rFonts w:ascii="Calibri" w:hAnsi="Calibri" w:eastAsia="Calibri"/>
           <w:color w:val="5B6B7F"/>
-          <w:sz w:val="19"/>
+          <w:sz w:val="18"/>
         </w:rPr>
-        <w:t xml:space="preserve">   ·   ISO/IEC 17025:2017 toolkit</w:t>
+        <w:t xml:space="preserve">   |   ISO/IEC 17025:2017 toolkit   |   Reality Diagnosis</w:t>
       </w:r>
     </w:p>
     <w:p>
       <w:pPr>
-        <w:spacing w:before="40" w:after="40"/>
+        <w:spacing w:before="200" w:after="40"/>
       </w:pPr>
       <w:r>
         <w:rPr>
-          <w:rFonts w:ascii="Calibri" w:hAnsi="Calibri" w:eastAsia="Microsoft YaHei"/>
+          <w:rFonts w:ascii="Calibri" w:hAnsi="Calibri" w:eastAsia="Calibri"/>
           <w:b/>
           <w:color w:val="0F2A4A"/>
-          <w:sz w:val="40"/>
+          <w:sz w:val="38"/>
         </w:rPr>
         <w:t>Laboratory Conformity Reality Diagnosis</w:t>
-      </w:r>
-    </w:p>
-    <w:p>
-      <w:r>
-        <w:rPr>
-          <w:rFonts w:ascii="Calibri" w:hAnsi="Calibri" w:eastAsia="Microsoft YaHei"/>
-          <w:b/>
-          <w:color w:val="0F2A4A"/>
-          <w:sz w:val="26"/>
-        </w:rPr>
-        <w:t>实验室符合性现状诊断（样例）</w:t>
-      </w:r>
-    </w:p>
-    <w:p>
-      <w:r>
-        <w:rPr>
-          <w:rFonts w:ascii="Calibri" w:hAnsi="Calibri" w:eastAsia="Microsoft YaHei"/>
-          <w:color w:val="5B6B7F"/>
-          <w:sz w:val="20"/>
-        </w:rPr>
-        <w:t>Sample structure &amp; depth — generic, not tailored to any lab.   样例结构与深度示意——通用版，非针对任何实验室。</w:t>
-      </w:r>
-    </w:p>
-    <w:p/>
-    <w:p>
-      <w:pPr w:spacing="120">
-        <w:shd w:val="clear" w:color="auto" w:fill="FFF7ED"/>
-        <w:pBdr>
-          <w:left w:val="single" w:sz="24" w:space="8" w:color="F59E0B"/>
-        </w:pBdr>
-      </w:pPr>
-      <w:r>
-        <w:rPr>
-          <w:rFonts w:ascii="Calibri" w:hAnsi="Calibri" w:eastAsia="Microsoft YaHei"/>
-          <w:b/>
-          <w:color w:val="B45309"/>
-          <w:sz w:val="22"/>
-        </w:rPr>
-        <w:t>DEMO SAMPLE · 样例 · 非完整交付物</w:t>
-        <w:br/>
-      </w:r>
-      <w:r>
-        <w:rPr>
-          <w:rFonts w:ascii="Calibri" w:hAnsi="Calibri" w:eastAsia="Microsoft YaHei"/>
-          <w:color w:val="B45309"/>
-          <w:sz w:val="20"/>
-        </w:rPr>
-        <w:t>This is a GENERIC sample showing the structure and depth of a LabKitPro Reality Diagnosis report. The full version is tailored to your country, accreditation body, industry and the documents you upload.</w:t>
-        <w:br/>
-        <w:t>这是通用样例，仅展示报告结构与深度。完整版将结合你的国家 / 认可机构 / 行业与上传文档生成。</w:t>
-      </w:r>
-    </w:p>
-    <w:p>
-      <w:pPr>
-        <w:pBdr>
-          <w:bottom w:val="single" w:sz="6" w:space="4" w:color="0F2A4A"/>
-        </w:pBdr>
-      </w:pPr>
-      <w:r>
-        <w:rPr>
-          <w:rFonts w:ascii="Calibri" w:hAnsi="Calibri" w:eastAsia="Microsoft YaHei"/>
-          <w:b/>
-          <w:color w:val="0F2A4A"/>
-          <w:sz w:val="28"/>
-        </w:rPr>
-        <w:t>1 · Purpose  /  一、用途</w:t>
       </w:r>
     </w:p>
     <w:p>
@@ -107,72 +47,700 @@
       </w:pPr>
       <w:r>
         <w:rPr>
-          <w:rFonts w:ascii="Calibri" w:hAnsi="Calibri" w:eastAsia="Microsoft YaHei"/>
-          <w:b w:val="0"/>
+          <w:rFonts w:ascii="Calibri" w:hAnsi="Calibri" w:eastAsia="Calibri"/>
+          <w:i/>
+          <w:color w:val="5B6B7F"/>
+          <w:sz w:val="20"/>
+        </w:rPr>
+        <w:t>ISO/IEC 17025:2017 · generic framework diagnosis · not tailored to any laboratory</w:t>
+      </w:r>
+    </w:p>
+    <w:p/>
+    <w:p>
+      <w:pPr w:spacing="160">
+        <w:spacing w:before="40" w:after="240"/>
+        <w:shd w:val="clear" w:color="auto" w:fill="FFF7ED"/>
+        <w:pBdr>
+          <w:left w:val="single" w:sz="30" w:space="6" w:color="F59E0B"/>
+        </w:pBdr>
+      </w:pPr>
+      <w:r>
+        <w:rPr>
+          <w:rFonts w:ascii="Calibri" w:hAnsi="Calibri" w:eastAsia="Calibri"/>
+          <w:b/>
+          <w:color w:val="B45309"/>
           <w:sz w:val="21"/>
         </w:rPr>
-        <w:t>Self-assess your lab against ISO/IEC 17025:2017 clauses §4–§8, overlaid with your accreditation body’s real review focus.</w:t>
+        <w:t>DEMO SAMPLE — what this file is</w:t>
+        <w:br/>
       </w:r>
       <w:r>
         <w:rPr>
-          <w:rFonts w:ascii="Calibri" w:hAnsi="Calibri" w:eastAsia="Microsoft YaHei"/>
-          <w:b w:val="0"/>
-          <w:sz w:val="21"/>
+          <w:rFonts w:ascii="Calibri" w:hAnsi="Calibri" w:eastAsia="Calibri"/>
+          <w:color w:val="B45309"/>
+          <w:sz w:val="19"/>
         </w:rPr>
-        <w:t xml:space="preserve">  依据 ISO/IEC 17025:2017 §4–§8 自评实验室符合性，并叠加所选认可机构的真实评审重点。</w:t>
+        <w:t>A generic sample showing the structure and depth of a LabKitPro Reality Diagnosis report. The paid full version is tailored to your country, accreditation body, industry and the documents you upload.</w:t>
       </w:r>
     </w:p>
     <w:p>
       <w:pPr>
+        <w:spacing w:before="280" w:after="100"/>
         <w:pBdr>
-          <w:bottom w:val="single" w:sz="6" w:space="4" w:color="0F2A4A"/>
+          <w:bottom w:val="single" w:sz="6" w:space="6" w:color="0F2A4A"/>
         </w:pBdr>
       </w:pPr>
       <w:r>
         <w:rPr>
-          <w:rFonts w:ascii="Calibri" w:hAnsi="Calibri" w:eastAsia="Microsoft YaHei"/>
+          <w:rFonts w:ascii="Calibri" w:hAnsi="Calibri" w:eastAsia="Calibri"/>
           <w:b/>
           <w:color w:val="0F2A4A"/>
-          <w:sz w:val="28"/>
+          <w:sz w:val="27"/>
         </w:rPr>
-        <w:t>2 · Scope  /  二、范围</w:t>
+        <w:t>1  Purpose</w:t>
       </w:r>
     </w:p>
     <w:p>
       <w:pPr>
-        <w:spacing w:after="80"/>
+        <w:spacing w:after="100" w:line="269" w:lineRule="auto"/>
       </w:pPr>
       <w:r>
         <w:rPr>
-          <w:rFonts w:ascii="Calibri" w:hAnsi="Calibri" w:eastAsia="Microsoft YaHei"/>
+          <w:rFonts w:ascii="Calibri" w:hAnsi="Calibri" w:eastAsia="Calibri"/>
           <w:b w:val="0"/>
+          <w:i w:val="0"/>
+          <w:color w:val="14202E"/>
           <w:sz w:val="21"/>
         </w:rPr>
-        <w:t>Generic ISO/IEC 17025:2017 framework (all labs). Full version narrows to your selected body (A2LA, UKAS, NABL, …) and industry.</w:t>
-      </w:r>
-      <w:r>
-        <w:rPr>
-          <w:rFonts w:ascii="Calibri" w:hAnsi="Calibri" w:eastAsia="Microsoft YaHei"/>
-          <w:b w:val="0"/>
-          <w:sz w:val="21"/>
-        </w:rPr>
-        <w:t xml:space="preserve">  通用 ISO/IEC 17025:2017 框架。完整版会细化到你选择的机构（A2LA、UKAS、NABL…）与行业。</w:t>
+        <w:t>Self-assess the laboratory against ISO/IEC 17025:2017 clauses §4–§8, overlaid with the real review focus of the selected accreditation body, and convert findings into prioritised actions.</w:t>
       </w:r>
     </w:p>
     <w:p>
       <w:pPr>
+        <w:spacing w:before="280" w:after="100"/>
         <w:pBdr>
-          <w:bottom w:val="single" w:sz="6" w:space="4" w:color="0F2A4A"/>
+          <w:bottom w:val="single" w:sz="6" w:space="6" w:color="0F2A4A"/>
         </w:pBdr>
       </w:pPr>
       <w:r>
         <w:rPr>
-          <w:rFonts w:ascii="Calibri" w:hAnsi="Calibri" w:eastAsia="Microsoft YaHei"/>
+          <w:rFonts w:ascii="Calibri" w:hAnsi="Calibri" w:eastAsia="Calibri"/>
           <w:b/>
           <w:color w:val="0F2A4A"/>
-          <w:sz w:val="28"/>
+          <w:sz w:val="27"/>
         </w:rPr>
-        <w:t>3 · Sample clause-section snapshot  /  三、章节符合性快照（示例）</w:t>
+        <w:t>2  Scope</w:t>
+      </w:r>
+    </w:p>
+    <w:p>
+      <w:pPr>
+        <w:spacing w:after="100" w:line="269" w:lineRule="auto"/>
+      </w:pPr>
+      <w:r>
+        <w:rPr>
+          <w:rFonts w:ascii="Calibri" w:hAnsi="Calibri" w:eastAsia="Calibri"/>
+          <w:b w:val="0"/>
+          <w:i w:val="0"/>
+          <w:color w:val="14202E"/>
+          <w:sz w:val="21"/>
+        </w:rPr>
+        <w:t>Generic ISO/IEC 17025:2017 framework applicable to all laboratories. The full version narrows to your selected body (A2LA, UKAS, NABL, …), your laboratory type and your industry.</w:t>
+      </w:r>
+    </w:p>
+    <w:p>
+      <w:pPr>
+        <w:spacing w:before="280" w:after="100"/>
+        <w:pBdr>
+          <w:bottom w:val="single" w:sz="6" w:space="6" w:color="0F2A4A"/>
+        </w:pBdr>
+      </w:pPr>
+      <w:r>
+        <w:rPr>
+          <w:rFonts w:ascii="Calibri" w:hAnsi="Calibri" w:eastAsia="Calibri"/>
+          <w:b/>
+          <w:color w:val="0F2A4A"/>
+          <w:sz w:val="27"/>
+        </w:rPr>
+        <w:t>3  Eight-lens conformity snapshot (sample)</w:t>
+      </w:r>
+    </w:p>
+    <w:tbl>
+      <w:tblPr>
+        <w:tblStyle w:val="TableGrid"/>
+        <w:tblW w:type="auto" w:w="0"/>
+        <w:jc w:val="center"/>
+        <w:tblLook w:firstColumn="1" w:firstRow="1" w:lastColumn="0" w:lastRow="0" w:noHBand="0" w:noVBand="1" w:val="04A0"/>
+      </w:tblPr>
+      <w:tblGrid>
+        <w:gridCol w:w="3216"/>
+        <w:gridCol w:w="3216"/>
+        <w:gridCol w:w="3216"/>
+      </w:tblGrid>
+      <w:tr>
+        <w:tc>
+          <w:tcPr>
+            <w:tcW w:type="dxa" w:w="2448"/>
+            <w:shd w:val="clear" w:color="auto" w:fill="0F2A4A"/>
+          </w:tcPr>
+          <w:p>
+            <w:pPr>
+              <w:spacing w:after="0"/>
+            </w:pPr>
+            <w:r/>
+            <w:r>
+              <w:rPr>
+                <w:rFonts w:ascii="Calibri" w:hAnsi="Calibri" w:eastAsia="Calibri"/>
+                <w:b/>
+                <w:color w:val="FFFFFF"/>
+                <w:sz w:val="18"/>
+              </w:rPr>
+              <w:t>Lens</w:t>
+            </w:r>
+          </w:p>
+        </w:tc>
+        <w:tc>
+          <w:tcPr>
+            <w:tcW w:type="dxa" w:w="1440"/>
+            <w:shd w:val="clear" w:color="auto" w:fill="0F2A4A"/>
+          </w:tcPr>
+          <w:p>
+            <w:pPr>
+              <w:spacing w:after="0"/>
+            </w:pPr>
+            <w:r/>
+            <w:r>
+              <w:rPr>
+                <w:rFonts w:ascii="Calibri" w:hAnsi="Calibri" w:eastAsia="Calibri"/>
+                <w:b/>
+                <w:color w:val="FFFFFF"/>
+                <w:sz w:val="18"/>
+              </w:rPr>
+              <w:t>Sample rating</w:t>
+            </w:r>
+          </w:p>
+        </w:tc>
+        <w:tc>
+          <w:tcPr>
+            <w:tcW w:type="dxa" w:w="5040"/>
+            <w:shd w:val="clear" w:color="auto" w:fill="0F2A4A"/>
+          </w:tcPr>
+          <w:p>
+            <w:pPr>
+              <w:spacing w:after="0"/>
+            </w:pPr>
+            <w:r/>
+            <w:r>
+              <w:rPr>
+                <w:rFonts w:ascii="Calibri" w:hAnsi="Calibri" w:eastAsia="Calibri"/>
+                <w:b/>
+                <w:color w:val="FFFFFF"/>
+                <w:sz w:val="18"/>
+              </w:rPr>
+              <w:t>Sample observation</w:t>
+            </w:r>
+          </w:p>
+        </w:tc>
+      </w:tr>
+      <w:tr>
+        <w:tc>
+          <w:tcPr>
+            <w:tcW w:type="dxa" w:w="2448"/>
+          </w:tcPr>
+          <w:p>
+            <w:pPr>
+              <w:spacing w:after="0"/>
+            </w:pPr>
+            <w:r/>
+            <w:r>
+              <w:rPr>
+                <w:rFonts w:ascii="Calibri" w:hAnsi="Calibri" w:eastAsia="Calibri"/>
+                <w:color w:val="14202E"/>
+                <w:sz w:val="18"/>
+              </w:rPr>
+              <w:t>Man (personnel)</w:t>
+            </w:r>
+          </w:p>
+        </w:tc>
+        <w:tc>
+          <w:tcPr>
+            <w:tcW w:type="dxa" w:w="1440"/>
+          </w:tcPr>
+          <w:p>
+            <w:pPr>
+              <w:spacing w:after="0"/>
+            </w:pPr>
+            <w:r/>
+            <w:r>
+              <w:rPr>
+                <w:rFonts w:ascii="Calibri" w:hAnsi="Calibri" w:eastAsia="Calibri"/>
+                <w:color w:val="14202E"/>
+                <w:sz w:val="18"/>
+              </w:rPr>
+              <w:t>Partial</w:t>
+            </w:r>
+          </w:p>
+        </w:tc>
+        <w:tc>
+          <w:tcPr>
+            <w:tcW w:type="dxa" w:w="5040"/>
+          </w:tcPr>
+          <w:p>
+            <w:pPr>
+              <w:spacing w:after="0"/>
+            </w:pPr>
+            <w:r/>
+            <w:r>
+              <w:rPr>
+                <w:rFonts w:ascii="Calibri" w:hAnsi="Calibri" w:eastAsia="Calibri"/>
+                <w:color w:val="14202E"/>
+                <w:sz w:val="18"/>
+              </w:rPr>
+              <w:t>Competence records incomplete for two analysts</w:t>
+            </w:r>
+          </w:p>
+        </w:tc>
+      </w:tr>
+      <w:tr>
+        <w:tc>
+          <w:tcPr>
+            <w:tcW w:type="dxa" w:w="2448"/>
+            <w:shd w:val="clear" w:color="auto" w:fill="F3F7FC"/>
+          </w:tcPr>
+          <w:p>
+            <w:pPr>
+              <w:spacing w:after="0"/>
+            </w:pPr>
+            <w:r/>
+            <w:r>
+              <w:rPr>
+                <w:rFonts w:ascii="Calibri" w:hAnsi="Calibri" w:eastAsia="Calibri"/>
+                <w:color w:val="14202E"/>
+                <w:sz w:val="18"/>
+              </w:rPr>
+              <w:t>Machine (equipment)</w:t>
+            </w:r>
+          </w:p>
+        </w:tc>
+        <w:tc>
+          <w:tcPr>
+            <w:tcW w:type="dxa" w:w="1440"/>
+            <w:shd w:val="clear" w:color="auto" w:fill="F3F7FC"/>
+          </w:tcPr>
+          <w:p>
+            <w:pPr>
+              <w:spacing w:after="0"/>
+            </w:pPr>
+            <w:r/>
+            <w:r>
+              <w:rPr>
+                <w:rFonts w:ascii="Calibri" w:hAnsi="Calibri" w:eastAsia="Calibri"/>
+                <w:color w:val="14202E"/>
+                <w:sz w:val="18"/>
+              </w:rPr>
+              <w:t>Good</w:t>
+            </w:r>
+          </w:p>
+        </w:tc>
+        <w:tc>
+          <w:tcPr>
+            <w:tcW w:type="dxa" w:w="5040"/>
+            <w:shd w:val="clear" w:color="auto" w:fill="F3F7FC"/>
+          </w:tcPr>
+          <w:p>
+            <w:pPr>
+              <w:spacing w:after="0"/>
+            </w:pPr>
+            <w:r/>
+            <w:r>
+              <w:rPr>
+                <w:rFonts w:ascii="Calibri" w:hAnsi="Calibri" w:eastAsia="Calibri"/>
+                <w:color w:val="14202E"/>
+                <w:sz w:val="18"/>
+              </w:rPr>
+              <w:t>Calibration status current; interim checks ad hoc</w:t>
+            </w:r>
+          </w:p>
+        </w:tc>
+      </w:tr>
+      <w:tr>
+        <w:tc>
+          <w:tcPr>
+            <w:tcW w:type="dxa" w:w="2448"/>
+          </w:tcPr>
+          <w:p>
+            <w:pPr>
+              <w:spacing w:after="0"/>
+            </w:pPr>
+            <w:r/>
+            <w:r>
+              <w:rPr>
+                <w:rFonts w:ascii="Calibri" w:hAnsi="Calibri" w:eastAsia="Calibri"/>
+                <w:color w:val="14202E"/>
+                <w:sz w:val="18"/>
+              </w:rPr>
+              <w:t>Material (items)</w:t>
+            </w:r>
+          </w:p>
+        </w:tc>
+        <w:tc>
+          <w:tcPr>
+            <w:tcW w:type="dxa" w:w="1440"/>
+          </w:tcPr>
+          <w:p>
+            <w:pPr>
+              <w:spacing w:after="0"/>
+            </w:pPr>
+            <w:r/>
+            <w:r>
+              <w:rPr>
+                <w:rFonts w:ascii="Calibri" w:hAnsi="Calibri" w:eastAsia="Calibri"/>
+                <w:color w:val="14202E"/>
+                <w:sz w:val="18"/>
+              </w:rPr>
+              <w:t>Partial</w:t>
+            </w:r>
+          </w:p>
+        </w:tc>
+        <w:tc>
+          <w:tcPr>
+            <w:tcW w:type="dxa" w:w="5040"/>
+          </w:tcPr>
+          <w:p>
+            <w:pPr>
+              <w:spacing w:after="0"/>
+            </w:pPr>
+            <w:r/>
+            <w:r>
+              <w:rPr>
+                <w:rFonts w:ascii="Calibri" w:hAnsi="Calibri" w:eastAsia="Calibri"/>
+                <w:color w:val="14202E"/>
+                <w:sz w:val="18"/>
+              </w:rPr>
+              <w:t>Handling and storage procedures present, not fully applied</w:t>
+            </w:r>
+          </w:p>
+        </w:tc>
+      </w:tr>
+      <w:tr>
+        <w:tc>
+          <w:tcPr>
+            <w:tcW w:type="dxa" w:w="2448"/>
+            <w:shd w:val="clear" w:color="auto" w:fill="F3F7FC"/>
+          </w:tcPr>
+          <w:p>
+            <w:pPr>
+              <w:spacing w:after="0"/>
+            </w:pPr>
+            <w:r/>
+            <w:r>
+              <w:rPr>
+                <w:rFonts w:ascii="Calibri" w:hAnsi="Calibri" w:eastAsia="Calibri"/>
+                <w:color w:val="14202E"/>
+                <w:sz w:val="18"/>
+              </w:rPr>
+              <w:t>Method</w:t>
+            </w:r>
+          </w:p>
+        </w:tc>
+        <w:tc>
+          <w:tcPr>
+            <w:tcW w:type="dxa" w:w="1440"/>
+            <w:shd w:val="clear" w:color="auto" w:fill="F3F7FC"/>
+          </w:tcPr>
+          <w:p>
+            <w:pPr>
+              <w:spacing w:after="0"/>
+            </w:pPr>
+            <w:r/>
+            <w:r>
+              <w:rPr>
+                <w:rFonts w:ascii="Calibri" w:hAnsi="Calibri" w:eastAsia="Calibri"/>
+                <w:color w:val="14202E"/>
+                <w:sz w:val="18"/>
+              </w:rPr>
+              <w:t>Partial</w:t>
+            </w:r>
+          </w:p>
+        </w:tc>
+        <w:tc>
+          <w:tcPr>
+            <w:tcW w:type="dxa" w:w="5040"/>
+            <w:shd w:val="clear" w:color="auto" w:fill="F3F7FC"/>
+          </w:tcPr>
+          <w:p>
+            <w:pPr>
+              <w:spacing w:after="0"/>
+            </w:pPr>
+            <w:r/>
+            <w:r>
+              <w:rPr>
+                <w:rFonts w:ascii="Calibri" w:hAnsi="Calibri" w:eastAsia="Calibri"/>
+                <w:color w:val="14202E"/>
+                <w:sz w:val="18"/>
+              </w:rPr>
+              <w:t>Method validation evidence thin for two methods</w:t>
+            </w:r>
+          </w:p>
+        </w:tc>
+      </w:tr>
+      <w:tr>
+        <w:tc>
+          <w:tcPr>
+            <w:tcW w:type="dxa" w:w="2448"/>
+          </w:tcPr>
+          <w:p>
+            <w:pPr>
+              <w:spacing w:after="0"/>
+            </w:pPr>
+            <w:r/>
+            <w:r>
+              <w:rPr>
+                <w:rFonts w:ascii="Calibri" w:hAnsi="Calibri" w:eastAsia="Calibri"/>
+                <w:color w:val="14202E"/>
+                <w:sz w:val="18"/>
+              </w:rPr>
+              <w:t>Environment</w:t>
+            </w:r>
+          </w:p>
+        </w:tc>
+        <w:tc>
+          <w:tcPr>
+            <w:tcW w:type="dxa" w:w="1440"/>
+          </w:tcPr>
+          <w:p>
+            <w:pPr>
+              <w:spacing w:after="0"/>
+            </w:pPr>
+            <w:r/>
+            <w:r>
+              <w:rPr>
+                <w:rFonts w:ascii="Calibri" w:hAnsi="Calibri" w:eastAsia="Calibri"/>
+                <w:color w:val="14202E"/>
+                <w:sz w:val="18"/>
+              </w:rPr>
+              <w:t>Good</w:t>
+            </w:r>
+          </w:p>
+        </w:tc>
+        <w:tc>
+          <w:tcPr>
+            <w:tcW w:type="dxa" w:w="5040"/>
+          </w:tcPr>
+          <w:p>
+            <w:pPr>
+              <w:spacing w:after="0"/>
+            </w:pPr>
+            <w:r/>
+            <w:r>
+              <w:rPr>
+                <w:rFonts w:ascii="Calibri" w:hAnsi="Calibri" w:eastAsia="Calibri"/>
+                <w:color w:val="14202E"/>
+                <w:sz w:val="18"/>
+              </w:rPr>
+              <w:t>Monitoring data available; limits not formally justified</w:t>
+            </w:r>
+          </w:p>
+        </w:tc>
+      </w:tr>
+      <w:tr>
+        <w:tc>
+          <w:tcPr>
+            <w:tcW w:type="dxa" w:w="2448"/>
+            <w:shd w:val="clear" w:color="auto" w:fill="F3F7FC"/>
+          </w:tcPr>
+          <w:p>
+            <w:pPr>
+              <w:spacing w:after="0"/>
+            </w:pPr>
+            <w:r/>
+            <w:r>
+              <w:rPr>
+                <w:rFonts w:ascii="Calibri" w:hAnsi="Calibri" w:eastAsia="Calibri"/>
+                <w:color w:val="14202E"/>
+                <w:sz w:val="18"/>
+              </w:rPr>
+              <w:t>Measurement (MU)</w:t>
+            </w:r>
+          </w:p>
+        </w:tc>
+        <w:tc>
+          <w:tcPr>
+            <w:tcW w:type="dxa" w:w="1440"/>
+            <w:shd w:val="clear" w:color="auto" w:fill="F3F7FC"/>
+          </w:tcPr>
+          <w:p>
+            <w:pPr>
+              <w:spacing w:after="0"/>
+            </w:pPr>
+            <w:r/>
+            <w:r>
+              <w:rPr>
+                <w:rFonts w:ascii="Calibri" w:hAnsi="Calibri" w:eastAsia="Calibri"/>
+                <w:color w:val="14202E"/>
+                <w:sz w:val="18"/>
+              </w:rPr>
+              <w:t>Partial</w:t>
+            </w:r>
+          </w:p>
+        </w:tc>
+        <w:tc>
+          <w:tcPr>
+            <w:tcW w:type="dxa" w:w="5040"/>
+            <w:shd w:val="clear" w:color="auto" w:fill="F3F7FC"/>
+          </w:tcPr>
+          <w:p>
+            <w:pPr>
+              <w:spacing w:after="0"/>
+            </w:pPr>
+            <w:r/>
+            <w:r>
+              <w:rPr>
+                <w:rFonts w:ascii="Calibri" w:hAnsi="Calibri" w:eastAsia="Calibri"/>
+                <w:color w:val="14202E"/>
+                <w:sz w:val="18"/>
+              </w:rPr>
+              <w:t>Uncertainty budgets exist but not maintained</w:t>
+            </w:r>
+          </w:p>
+        </w:tc>
+      </w:tr>
+      <w:tr>
+        <w:tc>
+          <w:tcPr>
+            <w:tcW w:type="dxa" w:w="2448"/>
+          </w:tcPr>
+          <w:p>
+            <w:pPr>
+              <w:spacing w:after="0"/>
+            </w:pPr>
+            <w:r/>
+            <w:r>
+              <w:rPr>
+                <w:rFonts w:ascii="Calibri" w:hAnsi="Calibri" w:eastAsia="Calibri"/>
+                <w:color w:val="14202E"/>
+                <w:sz w:val="18"/>
+              </w:rPr>
+              <w:t>System (management)</w:t>
+            </w:r>
+          </w:p>
+        </w:tc>
+        <w:tc>
+          <w:tcPr>
+            <w:tcW w:type="dxa" w:w="1440"/>
+          </w:tcPr>
+          <w:p>
+            <w:pPr>
+              <w:spacing w:after="0"/>
+            </w:pPr>
+            <w:r/>
+            <w:r>
+              <w:rPr>
+                <w:rFonts w:ascii="Calibri" w:hAnsi="Calibri" w:eastAsia="Calibri"/>
+                <w:color w:val="14202E"/>
+                <w:sz w:val="18"/>
+              </w:rPr>
+              <w:t>Partial</w:t>
+            </w:r>
+          </w:p>
+        </w:tc>
+        <w:tc>
+          <w:tcPr>
+            <w:tcW w:type="dxa" w:w="5040"/>
+          </w:tcPr>
+          <w:p>
+            <w:pPr>
+              <w:spacing w:after="0"/>
+            </w:pPr>
+            <w:r/>
+            <w:r>
+              <w:rPr>
+                <w:rFonts w:ascii="Calibri" w:hAnsi="Calibri" w:eastAsia="Calibri"/>
+                <w:color w:val="14202E"/>
+                <w:sz w:val="18"/>
+              </w:rPr>
+              <w:t>Internal-audit trail and CAPA closure weak</w:t>
+            </w:r>
+          </w:p>
+        </w:tc>
+      </w:tr>
+      <w:tr>
+        <w:tc>
+          <w:tcPr>
+            <w:tcW w:type="dxa" w:w="2448"/>
+            <w:shd w:val="clear" w:color="auto" w:fill="F3F7FC"/>
+          </w:tcPr>
+          <w:p>
+            <w:pPr>
+              <w:spacing w:after="0"/>
+            </w:pPr>
+            <w:r/>
+            <w:r>
+              <w:rPr>
+                <w:rFonts w:ascii="Calibri" w:hAnsi="Calibri" w:eastAsia="Calibri"/>
+                <w:color w:val="14202E"/>
+                <w:sz w:val="18"/>
+              </w:rPr>
+              <w:t>Impartiality</w:t>
+            </w:r>
+          </w:p>
+        </w:tc>
+        <w:tc>
+          <w:tcPr>
+            <w:tcW w:type="dxa" w:w="1440"/>
+            <w:shd w:val="clear" w:color="auto" w:fill="F3F7FC"/>
+          </w:tcPr>
+          <w:p>
+            <w:pPr>
+              <w:spacing w:after="0"/>
+            </w:pPr>
+            <w:r/>
+            <w:r>
+              <w:rPr>
+                <w:rFonts w:ascii="Calibri" w:hAnsi="Calibri" w:eastAsia="Calibri"/>
+                <w:color w:val="14202E"/>
+                <w:sz w:val="18"/>
+              </w:rPr>
+              <w:t>Good</w:t>
+            </w:r>
+          </w:p>
+        </w:tc>
+        <w:tc>
+          <w:tcPr>
+            <w:tcW w:type="dxa" w:w="5040"/>
+            <w:shd w:val="clear" w:color="auto" w:fill="F3F7FC"/>
+          </w:tcPr>
+          <w:p>
+            <w:pPr>
+              <w:spacing w:after="0"/>
+            </w:pPr>
+            <w:r/>
+            <w:r>
+              <w:rPr>
+                <w:rFonts w:ascii="Calibri" w:hAnsi="Calibri" w:eastAsia="Calibri"/>
+                <w:color w:val="14202E"/>
+                <w:sz w:val="18"/>
+              </w:rPr>
+              <w:t>Policy present; risk review performed annually</w:t>
+            </w:r>
+          </w:p>
+        </w:tc>
+      </w:tr>
+    </w:tbl>
+    <w:p>
+      <w:pPr>
+        <w:spacing w:before="280" w:after="100"/>
+        <w:pBdr>
+          <w:bottom w:val="single" w:sz="6" w:space="6" w:color="0F2A4A"/>
+        </w:pBdr>
+      </w:pPr>
+      <w:r>
+        <w:rPr>
+          <w:rFonts w:ascii="Calibri" w:hAnsi="Calibri" w:eastAsia="Calibri"/>
+          <w:b/>
+          <w:color w:val="0F2A4A"/>
+          <w:sz w:val="27"/>
+        </w:rPr>
+        <w:t>4  Clause-section snapshot (sample)</w:t>
       </w:r>
     </w:p>
     <w:tbl>
@@ -192,18 +760,19 @@
         <w:tc>
           <w:tcPr>
             <w:tcW w:type="dxa" w:w="1152"/>
+            <w:shd w:val="clear" w:color="auto" w:fill="0F2A4A"/>
           </w:tcPr>
           <w:p>
             <w:pPr>
-              <w:shd w:val="clear" w:color="auto" w:fill="0F2A4A"/>
+              <w:spacing w:after="0"/>
             </w:pPr>
             <w:r/>
             <w:r>
               <w:rPr>
-                <w:rFonts w:ascii="Calibri" w:hAnsi="Calibri" w:eastAsia="Microsoft YaHei"/>
+                <w:rFonts w:ascii="Calibri" w:hAnsi="Calibri" w:eastAsia="Calibri"/>
                 <w:b/>
                 <w:color w:val="FFFFFF"/>
-                <w:sz w:val="19"/>
+                <w:sz w:val="18"/>
               </w:rPr>
               <w:t>Clause</w:t>
             </w:r>
@@ -211,19 +780,20 @@
         </w:tc>
         <w:tc>
           <w:tcPr>
-            <w:tcW w:type="dxa" w:w="2016"/>
+            <w:tcW w:type="dxa" w:w="1872"/>
+            <w:shd w:val="clear" w:color="auto" w:fill="0F2A4A"/>
           </w:tcPr>
           <w:p>
             <w:pPr>
-              <w:shd w:val="clear" w:color="auto" w:fill="0F2A4A"/>
+              <w:spacing w:after="0"/>
             </w:pPr>
             <w:r/>
             <w:r>
               <w:rPr>
-                <w:rFonts w:ascii="Calibri" w:hAnsi="Calibri" w:eastAsia="Microsoft YaHei"/>
+                <w:rFonts w:ascii="Calibri" w:hAnsi="Calibri" w:eastAsia="Calibri"/>
                 <w:b/>
                 <w:color w:val="FFFFFF"/>
-                <w:sz w:val="19"/>
+                <w:sz w:val="18"/>
               </w:rPr>
               <w:t>Sample status</w:t>
             </w:r>
@@ -231,39 +801,41 @@
         </w:tc>
         <w:tc>
           <w:tcPr>
-            <w:tcW w:type="dxa" w:w="3168"/>
+            <w:tcW w:type="dxa" w:w="3744"/>
+            <w:shd w:val="clear" w:color="auto" w:fill="0F2A4A"/>
           </w:tcPr>
           <w:p>
             <w:pPr>
-              <w:shd w:val="clear" w:color="auto" w:fill="0F2A4A"/>
+              <w:spacing w:after="0"/>
             </w:pPr>
             <w:r/>
             <w:r>
               <w:rPr>
-                <w:rFonts w:ascii="Calibri" w:hAnsi="Calibri" w:eastAsia="Microsoft YaHei"/>
+                <w:rFonts w:ascii="Calibri" w:hAnsi="Calibri" w:eastAsia="Calibri"/>
                 <w:b/>
                 <w:color w:val="FFFFFF"/>
-                <w:sz w:val="19"/>
+                <w:sz w:val="18"/>
               </w:rPr>
-              <w:t>Key gap (example)</w:t>
+              <w:t>Illustrative gap</w:t>
             </w:r>
           </w:p>
         </w:tc>
         <w:tc>
           <w:tcPr>
-            <w:tcW w:type="dxa" w:w="2016"/>
+            <w:tcW w:type="dxa" w:w="1728"/>
+            <w:shd w:val="clear" w:color="auto" w:fill="0F2A4A"/>
           </w:tcPr>
           <w:p>
             <w:pPr>
-              <w:shd w:val="clear" w:color="auto" w:fill="0F2A4A"/>
+              <w:spacing w:after="0"/>
             </w:pPr>
             <w:r/>
             <w:r>
               <w:rPr>
-                <w:rFonts w:ascii="Calibri" w:hAnsi="Calibri" w:eastAsia="Microsoft YaHei"/>
+                <w:rFonts w:ascii="Calibri" w:hAnsi="Calibri" w:eastAsia="Calibri"/>
                 <w:b/>
                 <w:color w:val="FFFFFF"/>
-                <w:sz w:val="19"/>
+                <w:sz w:val="18"/>
               </w:rPr>
               <w:t>Linked template</w:t>
             </w:r>
@@ -276,12 +848,15 @@
             <w:tcW w:type="dxa" w:w="1152"/>
           </w:tcPr>
           <w:p>
+            <w:pPr>
+              <w:spacing w:after="0"/>
+            </w:pPr>
             <w:r/>
             <w:r>
               <w:rPr>
-                <w:rFonts w:ascii="Calibri" w:hAnsi="Calibri" w:eastAsia="Microsoft YaHei"/>
+                <w:rFonts w:ascii="Calibri" w:hAnsi="Calibri" w:eastAsia="Calibri"/>
                 <w:color w:val="14202E"/>
-                <w:sz w:val="19"/>
+                <w:sz w:val="18"/>
               </w:rPr>
               <w:t>§4</w:t>
             </w:r>
@@ -289,15 +864,18 @@
         </w:tc>
         <w:tc>
           <w:tcPr>
-            <w:tcW w:type="dxa" w:w="2016"/>
+            <w:tcW w:type="dxa" w:w="1872"/>
           </w:tcPr>
           <w:p>
+            <w:pPr>
+              <w:spacing w:after="0"/>
+            </w:pPr>
             <w:r/>
             <w:r>
               <w:rPr>
-                <w:rFonts w:ascii="Calibri" w:hAnsi="Calibri" w:eastAsia="Microsoft YaHei"/>
+                <w:rFonts w:ascii="Calibri" w:hAnsi="Calibri" w:eastAsia="Calibri"/>
                 <w:color w:val="14202E"/>
-                <w:sz w:val="19"/>
+                <w:sz w:val="18"/>
               </w:rPr>
               <w:t>Partial · 70%</w:t>
             </w:r>
@@ -305,31 +883,37 @@
         </w:tc>
         <w:tc>
           <w:tcPr>
-            <w:tcW w:type="dxa" w:w="3168"/>
+            <w:tcW w:type="dxa" w:w="3744"/>
           </w:tcPr>
           <w:p>
+            <w:pPr>
+              <w:spacing w:after="0"/>
+            </w:pPr>
             <w:r/>
             <w:r>
               <w:rPr>
-                <w:rFonts w:ascii="Calibri" w:hAnsi="Calibri" w:eastAsia="Microsoft YaHei"/>
+                <w:rFonts w:ascii="Calibri" w:hAnsi="Calibri" w:eastAsia="Calibri"/>
                 <w:color w:val="14202E"/>
-                <w:sz w:val="19"/>
+                <w:sz w:val="18"/>
               </w:rPr>
-              <w:t>Impartiality statement thin</w:t>
+              <w:t>Impartiality commitment not re-dated</w:t>
             </w:r>
           </w:p>
         </w:tc>
         <w:tc>
           <w:tcPr>
-            <w:tcW w:type="dxa" w:w="2016"/>
+            <w:tcW w:type="dxa" w:w="1728"/>
           </w:tcPr>
           <w:p>
+            <w:pPr>
+              <w:spacing w:after="0"/>
+            </w:pPr>
             <w:r/>
             <w:r>
               <w:rPr>
-                <w:rFonts w:ascii="Calibri" w:hAnsi="Calibri" w:eastAsia="Microsoft YaHei"/>
+                <w:rFonts w:ascii="Calibri" w:hAnsi="Calibri" w:eastAsia="Calibri"/>
                 <w:color w:val="14202E"/>
-                <w:sz w:val="19"/>
+                <w:sz w:val="18"/>
               </w:rPr>
               <w:t>FR-02</w:t>
             </w:r>
@@ -340,14 +924,18 @@
         <w:tc>
           <w:tcPr>
             <w:tcW w:type="dxa" w:w="1152"/>
+            <w:shd w:val="clear" w:color="auto" w:fill="F3F7FC"/>
           </w:tcPr>
           <w:p>
+            <w:pPr>
+              <w:spacing w:after="0"/>
+            </w:pPr>
             <w:r/>
             <w:r>
               <w:rPr>
-                <w:rFonts w:ascii="Calibri" w:hAnsi="Calibri" w:eastAsia="Microsoft YaHei"/>
+                <w:rFonts w:ascii="Calibri" w:hAnsi="Calibri" w:eastAsia="Calibri"/>
                 <w:color w:val="14202E"/>
-                <w:sz w:val="19"/>
+                <w:sz w:val="18"/>
               </w:rPr>
               <w:t>§5</w:t>
             </w:r>
@@ -355,15 +943,19 @@
         </w:tc>
         <w:tc>
           <w:tcPr>
-            <w:tcW w:type="dxa" w:w="2016"/>
+            <w:tcW w:type="dxa" w:w="1872"/>
+            <w:shd w:val="clear" w:color="auto" w:fill="F3F7FC"/>
           </w:tcPr>
           <w:p>
+            <w:pPr>
+              <w:spacing w:after="0"/>
+            </w:pPr>
             <w:r/>
             <w:r>
               <w:rPr>
-                <w:rFonts w:ascii="Calibri" w:hAnsi="Calibri" w:eastAsia="Microsoft YaHei"/>
+                <w:rFonts w:ascii="Calibri" w:hAnsi="Calibri" w:eastAsia="Calibri"/>
                 <w:color w:val="14202E"/>
-                <w:sz w:val="19"/>
+                <w:sz w:val="18"/>
               </w:rPr>
               <w:t>Partial · 65%</w:t>
             </w:r>
@@ -371,33 +963,41 @@
         </w:tc>
         <w:tc>
           <w:tcPr>
-            <w:tcW w:type="dxa" w:w="3168"/>
+            <w:tcW w:type="dxa" w:w="3744"/>
+            <w:shd w:val="clear" w:color="auto" w:fill="F3F7FC"/>
           </w:tcPr>
           <w:p>
+            <w:pPr>
+              <w:spacing w:after="0"/>
+            </w:pPr>
             <w:r/>
             <w:r>
               <w:rPr>
-                <w:rFonts w:ascii="Calibri" w:hAnsi="Calibri" w:eastAsia="Microsoft YaHei"/>
+                <w:rFonts w:ascii="Calibri" w:hAnsi="Calibri" w:eastAsia="Calibri"/>
                 <w:color w:val="14202E"/>
-                <w:sz w:val="19"/>
+                <w:sz w:val="18"/>
               </w:rPr>
-              <w:t>Management-review output missing</w:t>
+              <w:t>Responsibility matrix incomplete</w:t>
             </w:r>
           </w:p>
         </w:tc>
         <w:tc>
           <w:tcPr>
-            <w:tcW w:type="dxa" w:w="2016"/>
+            <w:tcW w:type="dxa" w:w="1728"/>
+            <w:shd w:val="clear" w:color="auto" w:fill="F3F7FC"/>
           </w:tcPr>
           <w:p>
+            <w:pPr>
+              <w:spacing w:after="0"/>
+            </w:pPr>
             <w:r/>
             <w:r>
               <w:rPr>
-                <w:rFonts w:ascii="Calibri" w:hAnsi="Calibri" w:eastAsia="Microsoft YaHei"/>
+                <w:rFonts w:ascii="Calibri" w:hAnsi="Calibri" w:eastAsia="Calibri"/>
                 <w:color w:val="14202E"/>
-                <w:sz w:val="19"/>
+                <w:sz w:val="18"/>
               </w:rPr>
-              <w:t>FR-05</w:t>
+              <w:t>FR-04</w:t>
             </w:r>
           </w:p>
         </w:tc>
@@ -408,12 +1008,15 @@
             <w:tcW w:type="dxa" w:w="1152"/>
           </w:tcPr>
           <w:p>
+            <w:pPr>
+              <w:spacing w:after="0"/>
+            </w:pPr>
             <w:r/>
             <w:r>
               <w:rPr>
-                <w:rFonts w:ascii="Calibri" w:hAnsi="Calibri" w:eastAsia="Microsoft YaHei"/>
+                <w:rFonts w:ascii="Calibri" w:hAnsi="Calibri" w:eastAsia="Calibri"/>
                 <w:color w:val="14202E"/>
-                <w:sz w:val="19"/>
+                <w:sz w:val="18"/>
               </w:rPr>
               <w:t>§6</w:t>
             </w:r>
@@ -421,15 +1024,18 @@
         </w:tc>
         <w:tc>
           <w:tcPr>
-            <w:tcW w:type="dxa" w:w="2016"/>
+            <w:tcW w:type="dxa" w:w="1872"/>
           </w:tcPr>
           <w:p>
+            <w:pPr>
+              <w:spacing w:after="0"/>
+            </w:pPr>
             <w:r/>
             <w:r>
               <w:rPr>
-                <w:rFonts w:ascii="Calibri" w:hAnsi="Calibri" w:eastAsia="Microsoft YaHei"/>
+                <w:rFonts w:ascii="Calibri" w:hAnsi="Calibri" w:eastAsia="Calibri"/>
                 <w:color w:val="14202E"/>
-                <w:sz w:val="19"/>
+                <w:sz w:val="18"/>
               </w:rPr>
               <w:t>Partial · 60%</w:t>
             </w:r>
@@ -437,15 +1043,18 @@
         </w:tc>
         <w:tc>
           <w:tcPr>
-            <w:tcW w:type="dxa" w:w="3168"/>
+            <w:tcW w:type="dxa" w:w="3744"/>
           </w:tcPr>
           <w:p>
+            <w:pPr>
+              <w:spacing w:after="0"/>
+            </w:pPr>
             <w:r/>
             <w:r>
               <w:rPr>
-                <w:rFonts w:ascii="Calibri" w:hAnsi="Calibri" w:eastAsia="Microsoft YaHei"/>
+                <w:rFonts w:ascii="Calibri" w:hAnsi="Calibri" w:eastAsia="Calibri"/>
                 <w:color w:val="14202E"/>
-                <w:sz w:val="19"/>
+                <w:sz w:val="18"/>
               </w:rPr>
               <w:t>Competence monitoring weak</w:t>
             </w:r>
@@ -453,15 +1062,18 @@
         </w:tc>
         <w:tc>
           <w:tcPr>
-            <w:tcW w:type="dxa" w:w="2016"/>
+            <w:tcW w:type="dxa" w:w="1728"/>
           </w:tcPr>
           <w:p>
+            <w:pPr>
+              <w:spacing w:after="0"/>
+            </w:pPr>
             <w:r/>
             <w:r>
               <w:rPr>
-                <w:rFonts w:ascii="Calibri" w:hAnsi="Calibri" w:eastAsia="Microsoft YaHei"/>
+                <w:rFonts w:ascii="Calibri" w:hAnsi="Calibri" w:eastAsia="Calibri"/>
                 <w:color w:val="14202E"/>
-                <w:sz w:val="19"/>
+                <w:sz w:val="18"/>
               </w:rPr>
               <w:t>FR-09</w:t>
             </w:r>
@@ -472,14 +1084,18 @@
         <w:tc>
           <w:tcPr>
             <w:tcW w:type="dxa" w:w="1152"/>
+            <w:shd w:val="clear" w:color="auto" w:fill="F3F7FC"/>
           </w:tcPr>
           <w:p>
+            <w:pPr>
+              <w:spacing w:after="0"/>
+            </w:pPr>
             <w:r/>
             <w:r>
               <w:rPr>
-                <w:rFonts w:ascii="Calibri" w:hAnsi="Calibri" w:eastAsia="Microsoft YaHei"/>
+                <w:rFonts w:ascii="Calibri" w:hAnsi="Calibri" w:eastAsia="Calibri"/>
                 <w:color w:val="14202E"/>
-                <w:sz w:val="19"/>
+                <w:sz w:val="18"/>
               </w:rPr>
               <w:t>§7</w:t>
             </w:r>
@@ -487,15 +1103,19 @@
         </w:tc>
         <w:tc>
           <w:tcPr>
-            <w:tcW w:type="dxa" w:w="2016"/>
+            <w:tcW w:type="dxa" w:w="1872"/>
+            <w:shd w:val="clear" w:color="auto" w:fill="F3F7FC"/>
           </w:tcPr>
           <w:p>
+            <w:pPr>
+              <w:spacing w:after="0"/>
+            </w:pPr>
             <w:r/>
             <w:r>
               <w:rPr>
-                <w:rFonts w:ascii="Calibri" w:hAnsi="Calibri" w:eastAsia="Microsoft YaHei"/>
+                <w:rFonts w:ascii="Calibri" w:hAnsi="Calibri" w:eastAsia="Calibri"/>
                 <w:color w:val="14202E"/>
-                <w:sz w:val="19"/>
+                <w:sz w:val="18"/>
               </w:rPr>
               <w:t>Partial · 55%</w:t>
             </w:r>
@@ -503,15 +1123,19 @@
         </w:tc>
         <w:tc>
           <w:tcPr>
-            <w:tcW w:type="dxa" w:w="3168"/>
+            <w:tcW w:type="dxa" w:w="3744"/>
+            <w:shd w:val="clear" w:color="auto" w:fill="F3F7FC"/>
           </w:tcPr>
           <w:p>
+            <w:pPr>
+              <w:spacing w:after="0"/>
+            </w:pPr>
             <w:r/>
             <w:r>
               <w:rPr>
-                <w:rFonts w:ascii="Calibri" w:hAnsi="Calibri" w:eastAsia="Microsoft YaHei"/>
+                <w:rFonts w:ascii="Calibri" w:hAnsi="Calibri" w:eastAsia="Calibri"/>
                 <w:color w:val="14202E"/>
-                <w:sz w:val="19"/>
+                <w:sz w:val="18"/>
               </w:rPr>
               <w:t>Method validation thin</w:t>
             </w:r>
@@ -519,15 +1143,19 @@
         </w:tc>
         <w:tc>
           <w:tcPr>
-            <w:tcW w:type="dxa" w:w="2016"/>
+            <w:tcW w:type="dxa" w:w="1728"/>
+            <w:shd w:val="clear" w:color="auto" w:fill="F3F7FC"/>
           </w:tcPr>
           <w:p>
+            <w:pPr>
+              <w:spacing w:after="0"/>
+            </w:pPr>
             <w:r/>
             <w:r>
               <w:rPr>
-                <w:rFonts w:ascii="Calibri" w:hAnsi="Calibri" w:eastAsia="Microsoft YaHei"/>
+                <w:rFonts w:ascii="Calibri" w:hAnsi="Calibri" w:eastAsia="Calibri"/>
                 <w:color w:val="14202E"/>
-                <w:sz w:val="19"/>
+                <w:sz w:val="18"/>
               </w:rPr>
               <w:t>FR-13</w:t>
             </w:r>
@@ -540,12 +1168,15 @@
             <w:tcW w:type="dxa" w:w="1152"/>
           </w:tcPr>
           <w:p>
+            <w:pPr>
+              <w:spacing w:after="0"/>
+            </w:pPr>
             <w:r/>
             <w:r>
               <w:rPr>
-                <w:rFonts w:ascii="Calibri" w:hAnsi="Calibri" w:eastAsia="Microsoft YaHei"/>
+                <w:rFonts w:ascii="Calibri" w:hAnsi="Calibri" w:eastAsia="Calibri"/>
                 <w:color w:val="14202E"/>
-                <w:sz w:val="19"/>
+                <w:sz w:val="18"/>
               </w:rPr>
               <w:t>§8</w:t>
             </w:r>
@@ -553,15 +1184,18 @@
         </w:tc>
         <w:tc>
           <w:tcPr>
-            <w:tcW w:type="dxa" w:w="2016"/>
+            <w:tcW w:type="dxa" w:w="1872"/>
           </w:tcPr>
           <w:p>
+            <w:pPr>
+              <w:spacing w:after="0"/>
+            </w:pPr>
             <w:r/>
             <w:r>
               <w:rPr>
-                <w:rFonts w:ascii="Calibri" w:hAnsi="Calibri" w:eastAsia="Microsoft YaHei"/>
+                <w:rFonts w:ascii="Calibri" w:hAnsi="Calibri" w:eastAsia="Calibri"/>
                 <w:color w:val="14202E"/>
-                <w:sz w:val="19"/>
+                <w:sz w:val="18"/>
               </w:rPr>
               <w:t>Partial · 68%</w:t>
             </w:r>
@@ -569,15 +1203,18 @@
         </w:tc>
         <w:tc>
           <w:tcPr>
-            <w:tcW w:type="dxa" w:w="3168"/>
+            <w:tcW w:type="dxa" w:w="3744"/>
           </w:tcPr>
           <w:p>
+            <w:pPr>
+              <w:spacing w:after="0"/>
+            </w:pPr>
             <w:r/>
             <w:r>
               <w:rPr>
-                <w:rFonts w:ascii="Calibri" w:hAnsi="Calibri" w:eastAsia="Microsoft YaHei"/>
+                <w:rFonts w:ascii="Calibri" w:hAnsi="Calibri" w:eastAsia="Calibri"/>
                 <w:color w:val="14202E"/>
-                <w:sz w:val="19"/>
+                <w:sz w:val="18"/>
               </w:rPr>
               <w:t>Internal-audit trail sparse</w:t>
             </w:r>
@@ -585,15 +1222,18 @@
         </w:tc>
         <w:tc>
           <w:tcPr>
-            <w:tcW w:type="dxa" w:w="2016"/>
+            <w:tcW w:type="dxa" w:w="1728"/>
           </w:tcPr>
           <w:p>
+            <w:pPr>
+              <w:spacing w:after="0"/>
+            </w:pPr>
             <w:r/>
             <w:r>
               <w:rPr>
-                <w:rFonts w:ascii="Calibri" w:hAnsi="Calibri" w:eastAsia="Microsoft YaHei"/>
+                <w:rFonts w:ascii="Calibri" w:hAnsi="Calibri" w:eastAsia="Calibri"/>
                 <w:color w:val="14202E"/>
-                <w:sz w:val="19"/>
+                <w:sz w:val="18"/>
               </w:rPr>
               <w:t>FR-21</w:t>
             </w:r>
@@ -603,168 +1243,133 @@
     </w:tbl>
     <w:p>
       <w:pPr>
+        <w:spacing w:before="280" w:after="100"/>
         <w:pBdr>
-          <w:bottom w:val="single" w:sz="6" w:space="4" w:color="0F2A4A"/>
+          <w:bottom w:val="single" w:sz="6" w:space="6" w:color="0F2A4A"/>
         </w:pBdr>
       </w:pPr>
       <w:r>
         <w:rPr>
-          <w:rFonts w:ascii="Calibri" w:hAnsi="Calibri" w:eastAsia="Microsoft YaHei"/>
+          <w:rFonts w:ascii="Calibri" w:hAnsi="Calibri" w:eastAsia="Calibri"/>
           <w:b/>
           <w:color w:val="0F2A4A"/>
-          <w:sz w:val="28"/>
+          <w:sz w:val="27"/>
         </w:rPr>
-        <w:t>4 · What the FULL version adds  /  四、完整版额外包含</w:t>
+        <w:t>5  What the full deliverable adds</w:t>
       </w:r>
     </w:p>
     <w:p>
       <w:pPr>
         <w:pStyle w:val="ListBullet"/>
-        <w:spacing w:after="40"/>
+        <w:spacing w:after="60"/>
       </w:pPr>
       <w:r>
         <w:rPr>
-          <w:rFonts w:ascii="Calibri" w:hAnsi="Calibri" w:eastAsia="Microsoft YaHei"/>
+          <w:rFonts w:ascii="Calibri" w:hAnsi="Calibri" w:eastAsia="Calibri"/>
           <w:color w:val="5B6B7F"/>
           <w:sz w:val="21"/>
         </w:rPr>
-        <w:t xml:space="preserve">Eight-lens diagnosis (Man/Machine/Material/Method/Environment/Measurement/System/Impartiality) —   </w:t>
+        <w:t xml:space="preserve">Narrative consultant view — </w:t>
       </w:r>
       <w:r>
         <w:rPr>
-          <w:rFonts w:ascii="Calibri" w:hAnsi="Calibri" w:eastAsia="Microsoft YaHei"/>
+          <w:rFonts w:ascii="Calibri" w:hAnsi="Calibri" w:eastAsia="Calibri"/>
+          <w:b/>
           <w:color w:val="0F2A4A"/>
           <w:sz w:val="21"/>
         </w:rPr>
-        <w:t>八维诊断（人/机/料/法/环/测/组织/公正）</w:t>
+        <w:t>bright spots, overall judgement and priority actions, written for you.</w:t>
       </w:r>
     </w:p>
     <w:p>
       <w:pPr>
         <w:pStyle w:val="ListBullet"/>
-        <w:spacing w:after="40"/>
+        <w:spacing w:after="60"/>
       </w:pPr>
       <w:r>
         <w:rPr>
-          <w:rFonts w:ascii="Calibri" w:hAnsi="Calibri" w:eastAsia="Microsoft YaHei"/>
+          <w:rFonts w:ascii="Calibri" w:hAnsi="Calibri" w:eastAsia="Calibri"/>
           <w:color w:val="5B6B7F"/>
           <w:sz w:val="21"/>
         </w:rPr>
-        <w:t xml:space="preserve">Consultant narrative tailored to your inputs (bright spots, judgment, priority actions) —   </w:t>
+        <w:t xml:space="preserve">Body-specific focus — </w:t>
       </w:r>
       <w:r>
         <w:rPr>
-          <w:rFonts w:ascii="Calibri" w:hAnsi="Calibri" w:eastAsia="Microsoft YaHei"/>
+          <w:rFonts w:ascii="Calibri" w:hAnsi="Calibri" w:eastAsia="Calibri"/>
+          <w:b/>
           <w:color w:val="0F2A4A"/>
           <w:sz w:val="21"/>
         </w:rPr>
-        <w:t>结合你输入的顾问视角（亮点、整体判断、优先动作）</w:t>
+        <w:t>your accreditation body’s real review points and mandatory clauses.</w:t>
       </w:r>
     </w:p>
     <w:p>
       <w:pPr>
         <w:pStyle w:val="ListBullet"/>
-        <w:spacing w:after="40"/>
+        <w:spacing w:after="60"/>
       </w:pPr>
       <w:r>
         <w:rPr>
-          <w:rFonts w:ascii="Calibri" w:hAnsi="Calibri" w:eastAsia="Microsoft YaHei"/>
+          <w:rFonts w:ascii="Calibri" w:hAnsi="Calibri" w:eastAsia="Calibri"/>
           <w:color w:val="5B6B7F"/>
           <w:sz w:val="21"/>
         </w:rPr>
-        <w:t xml:space="preserve">Body-specific mandatory clauses &amp; prohibited terms woven in —   </w:t>
+        <w:t xml:space="preserve">Your inputs used directly — </w:t>
       </w:r>
       <w:r>
         <w:rPr>
-          <w:rFonts w:ascii="Calibri" w:hAnsi="Calibri" w:eastAsia="Microsoft YaHei"/>
+          <w:rFonts w:ascii="Calibri" w:hAnsi="Calibri" w:eastAsia="Calibri"/>
+          <w:b/>
           <w:color w:val="0F2A4A"/>
           <w:sz w:val="21"/>
         </w:rPr>
-        <w:t>嵌入你机构的强制条款与禁用语</w:t>
+        <w:t>country, body, industry, stage and any document you upload.</w:t>
       </w:r>
     </w:p>
     <w:p>
       <w:pPr>
         <w:pStyle w:val="ListBullet"/>
-        <w:spacing w:after="40"/>
+        <w:spacing w:after="60"/>
       </w:pPr>
       <w:r>
         <w:rPr>
-          <w:rFonts w:ascii="Calibri" w:hAnsi="Calibri" w:eastAsia="Microsoft YaHei"/>
+          <w:rFonts w:ascii="Calibri" w:hAnsi="Calibri" w:eastAsia="Calibri"/>
           <w:color w:val="5B6B7F"/>
           <w:sz w:val="21"/>
         </w:rPr>
-        <w:t xml:space="preserve">Your QM/PR/industry expanded per your lab —   </w:t>
+        <w:t xml:space="preserve">Exportable, watermark-free Word (.docx) — </w:t>
       </w:r>
       <w:r>
         <w:rPr>
-          <w:rFonts w:ascii="Calibri" w:hAnsi="Calibri" w:eastAsia="Microsoft YaHei"/>
+          <w:rFonts w:ascii="Calibri" w:hAnsi="Calibri" w:eastAsia="Calibri"/>
+          <w:b/>
           <w:color w:val="0F2A4A"/>
           <w:sz w:val="21"/>
         </w:rPr>
-        <w:t>按你的质量手册/程序/行业展开</w:t>
+        <w:t>ready to circulate internally.</w:t>
       </w:r>
     </w:p>
     <w:p>
       <w:pPr>
-        <w:pStyle w:val="ListBullet"/>
-        <w:spacing w:after="40"/>
+        <w:spacing w:after="100" w:line="269" w:lineRule="auto"/>
       </w:pPr>
       <w:r>
         <w:rPr>
-          <w:rFonts w:ascii="Calibri" w:hAnsi="Calibri" w:eastAsia="Microsoft YaHei"/>
-          <w:color w:val="5B6B7F"/>
-          <w:sz w:val="21"/>
-        </w:rPr>
-        <w:t xml:space="preserve">Exportable, watermark-free Word (.docx) —   </w:t>
-      </w:r>
-      <w:r>
-        <w:rPr>
-          <w:rFonts w:ascii="Calibri" w:hAnsi="Calibri" w:eastAsia="Microsoft YaHei"/>
-          <w:color w:val="0F2A4A"/>
-          <w:sz w:val="21"/>
-        </w:rPr>
-        <w:t>可导出、去水印 Word</w:t>
-      </w:r>
-    </w:p>
-    <w:p>
-      <w:r>
-        <w:rPr>
-          <w:rFonts w:ascii="Calibri" w:hAnsi="Calibri" w:eastAsia="Microsoft YaHei"/>
-          <w:b/>
-          <w:color w:val="1F6FEB"/>
-          <w:sz w:val="23"/>
-        </w:rPr>
-        <w:t>Unlock  /  解锁</w:t>
-      </w:r>
-    </w:p>
-    <w:p>
-      <w:pPr>
-        <w:spacing w:after="80"/>
-      </w:pPr>
-      <w:r>
-        <w:rPr>
-          <w:rFonts w:ascii="Calibri" w:hAnsi="Calibri" w:eastAsia="Microsoft YaHei"/>
+          <w:rFonts w:ascii="Calibri" w:hAnsi="Calibri" w:eastAsia="Calibri"/>
           <w:b w:val="0"/>
+          <w:i/>
           <w:color w:val="5B6B7F"/>
           <w:sz w:val="20"/>
         </w:rPr>
-        <w:t>Free users see the generic framework version above. Unlock to get the tailored, watermark-free deliverable at labkitpro.com.</w:t>
-      </w:r>
-      <w:r>
-        <w:rPr>
-          <w:rFonts w:ascii="Calibri" w:hAnsi="Calibri" w:eastAsia="Microsoft YaHei"/>
-          <w:b w:val="0"/>
-          <w:color w:val="5B6B7F"/>
-          <w:sz w:val="20"/>
-        </w:rPr>
-        <w:t xml:space="preserve">  免费用户看到上方的通用框架版。解锁后可获得按你情况定制的、去水印的交付物：labkitpro.com。</w:t>
+        <w:t>Free users see the generic framework version above. Unlock the tailored, watermark-free deliverable at labkitpro.com.</w:t>
       </w:r>
     </w:p>
     <w:sectPr>
-      <w:footerReference w:type="default" r:id="rId9"/>
+      <w:headerReference w:type="default" r:id="rId9"/>
+      <w:footerReference w:type="default" r:id="rId10"/>
       <w:pgSz w:w="12240" w:h="15840"/>
-      <w:pgMar w:top="1152" w:right="1296" w:bottom="1152" w:left="1296" w:header="720" w:footer="720" w:gutter="0"/>
+      <w:pgMar w:top="1224" w:right="1296" w:bottom="1152" w:left="1296" w:header="720" w:footer="720" w:gutter="0"/>
       <w:cols w:space="720"/>
       <w:docGrid w:linePitch="360"/>
     </w:sectPr>
@@ -781,17 +1386,17 @@
     </w:pPr>
     <w:r>
       <w:rPr>
-        <w:rFonts w:ascii="Calibri" w:hAnsi="Calibri" w:eastAsia="Microsoft YaHei"/>
+        <w:rFonts w:ascii="Calibri" w:hAnsi="Calibri" w:eastAsia="Calibri"/>
         <w:color w:val="94A3B8"/>
-        <w:sz w:val="18"/>
-      </w:rPr>
-      <w:t xml:space="preserve">LabKitPro · Generic demo sample · Not a full deliverable    |    Page </w:t>
+        <w:sz w:val="17"/>
+      </w:rPr>
+      <w:t xml:space="preserve">LabKitPro  ·  ISO/IEC 17025:2017 toolkit  ·  labkitpro.com        Page </w:t>
     </w:r>
     <w:r>
       <w:rPr>
-        <w:rFonts w:ascii="Calibri" w:hAnsi="Calibri" w:eastAsia="Microsoft YaHei"/>
+        <w:rFonts w:ascii="Calibri" w:hAnsi="Calibri" w:eastAsia="Calibri"/>
         <w:color w:val="94A3B8"/>
-        <w:sz w:val="18"/>
+        <w:sz w:val="17"/>
       </w:rPr>
       <w:fldChar w:fldCharType="begin"/>
       <w:instrText xml:space="preserve">PAGE</w:instrText>
@@ -799,6 +1404,26 @@
     </w:r>
   </w:p>
 </w:ftr>
+</file>
+
+<file path=word/header1.xml><?xml version="1.0" encoding="utf-8"?>
+<w:hdr xmlns:m="http://schemas.openxmlformats.org/officeDocument/2006/math" xmlns:mc="http://schemas.openxmlformats.org/markup-compatibility/2006" xmlns:mo="http://schemas.microsoft.com/office/mac/office/2008/main" xmlns:mv="urn:schemas-microsoft-com:mac:vml" xmlns:o="urn:schemas-microsoft-com:office:office" xmlns:r="http://schemas.openxmlformats.org/officeDocument/2006/relationships" xmlns:v="urn:schemas-microsoft-com:vml" xmlns:w10="urn:schemas-microsoft-com:office:word" xmlns:w14="http://schemas.microsoft.com/office/word/2010/wordml" xmlns:w="http://schemas.openxmlformats.org/wordprocessingml/2006/main" xmlns:wne="http://schemas.microsoft.com/office/word/2006/wordml" xmlns:wp14="http://schemas.microsoft.com/office/word/2010/wordprocessingDrawing" xmlns:wp="http://schemas.openxmlformats.org/drawingml/2006/wordprocessingDrawing" xmlns:wpc="http://schemas.microsoft.com/office/word/2010/wordprocessingCanvas" xmlns:wpg="http://schemas.microsoft.com/office/word/2010/wordprocessingGroup" xmlns:wpi="http://schemas.microsoft.com/office/word/2010/wordprocessingInk" xmlns:wps="http://schemas.microsoft.com/office/word/2010/wordprocessingShape" mc:Ignorable="w14 wp14">
+  <w:p>
+    <w:pPr>
+      <w:pStyle w:val="Header"/>
+      <w:jc w:val="right"/>
+    </w:pPr>
+    <w:r>
+      <w:rPr>
+        <w:rFonts w:ascii="Calibri" w:hAnsi="Calibri" w:eastAsia="Calibri"/>
+        <w:b/>
+        <w:color w:val="94A3B8"/>
+        <w:sz w:val="16"/>
+      </w:rPr>
+      <w:t>DEMO SAMPLE  ·  NOT A FULL DELIVERABLE</w:t>
+    </w:r>
+  </w:p>
+</w:hdr>
 </file>
 
 <file path=word/numbering.xml><?xml version="1.0" encoding="utf-8"?>
@@ -1164,6 +1789,9 @@
     <w:name w:val="Normal"/>
     <w:qFormat/>
     <w:rsid w:val="00FC693F"/>
+    <w:pPr>
+      <w:spacing w:after="100"/>
+    </w:pPr>
     <w:rPr>
       <w:rFonts w:ascii="Calibri" w:hAnsi="Calibri"/>
       <w:sz w:val="21"/>

</xml_diff>